<commit_message>
Add FPGA USB Image Proxy project; add Canadian number to Resume/CV
- New Digital Systems & FPGA project (ENGI 9865): heterogeneous Cyclone V SoC,
  VHDL VGA controller, HPS BMP decoder, ModelSim verification; report/proposal/
  slides hosted
- Add Canadian phone number to Resume and CV (PDF + DOCX) alongside the existing
  number
</commit_message>
<xml_diff>
--- a/site/public/docs/Innocent_Onwukanjo_CV.docx
+++ b/site/public/docs/Innocent_Onwukanjo_CV.docx
@@ -81,14 +81,14 @@
           <w:sz w:val="18"/>
           <w:szCs w:val="18"/>
         </w:rPr>
-        <w:t xml:space="preserve">+234 816 185 1085</w:t>
+        <w:t xml:space="preserve">+1 709 730 4149 / +234 816 185 1085</w:t>
       </w:r>
     </w:p>
     <w:p>
       <w:pPr>
         <w:spacing w:after="40"/>
       </w:pPr>
-      <w:hyperlink w:history="1" r:id="rIdlkzp0_ncedwxtlslcg-cc">
+      <w:hyperlink w:history="1" r:id="rIdja2i51asttactnsodry8o">
         <w:r>
           <w:rPr>
             <w:rFonts w:ascii="Calibri" w:cs="Calibri" w:eastAsia="Calibri" w:hAnsi="Calibri"/>
@@ -109,7 +109,7 @@
         </w:rPr>
         <w:t xml:space="preserve">   |   </w:t>
       </w:r>
-      <w:hyperlink w:history="1" r:id="rIdxd2uq9cvwxdsy1tvyboy9">
+      <w:hyperlink w:history="1" r:id="rIdsv8cxu0r-7zcegdv-ybc-">
         <w:r>
           <w:rPr>
             <w:rFonts w:ascii="Calibri" w:cs="Calibri" w:eastAsia="Calibri" w:hAnsi="Calibri"/>
@@ -130,7 +130,7 @@
         </w:rPr>
         <w:t xml:space="preserve">   |   </w:t>
       </w:r>
-      <w:hyperlink w:history="1" r:id="rIdni6msxdx0hcs-ka-rx4qo">
+      <w:hyperlink w:history="1" r:id="rIdc1d5upicjpsao1o1tiqw3">
         <w:r>
           <w:rPr>
             <w:rFonts w:ascii="Calibri" w:cs="Calibri" w:eastAsia="Calibri" w:hAnsi="Calibri"/>

</xml_diff>